<commit_message>
adaugare semnaturi in docs generate
</commit_message>
<xml_diff>
--- a/dist/Gestiune_clienti_sqlite_portabil_v3/_internal/template/declaratie_instalare.docx
+++ b/dist/Gestiune_clienti_sqlite_portabil_v3/_internal/template/declaratie_instalare.docx
@@ -112,15 +112,97 @@
           <w:szCs w:val="24"/>
         </w:rPr>
       </w:pPr>
-      <w:r>
-        <w:rPr>
-          <w:rFonts w:ascii="Arial" w:hAnsi="Arial" w:cs="Arial"/>
-          <w:color w:val="000000"/>
-          <w:sz w:val="24"/>
-          <w:szCs w:val="24"/>
-        </w:rPr>
-        <w:t>a aparatelor electronice de marcat fiscale</w:t>
-      </w:r>
+      <w:proofErr w:type="gramStart"/>
+      <w:r>
+        <w:rPr>
+          <w:rFonts w:ascii="Arial" w:hAnsi="Arial" w:cs="Arial"/>
+          <w:color w:val="000000"/>
+          <w:sz w:val="24"/>
+          <w:szCs w:val="24"/>
+        </w:rPr>
+        <w:t>a</w:t>
+      </w:r>
+      <w:proofErr w:type="gramEnd"/>
+      <w:r>
+        <w:rPr>
+          <w:rFonts w:ascii="Arial" w:hAnsi="Arial" w:cs="Arial"/>
+          <w:color w:val="000000"/>
+          <w:sz w:val="24"/>
+          <w:szCs w:val="24"/>
+        </w:rPr>
+        <w:t xml:space="preserve"> </w:t>
+      </w:r>
+      <w:proofErr w:type="spellStart"/>
+      <w:r>
+        <w:rPr>
+          <w:rFonts w:ascii="Arial" w:hAnsi="Arial" w:cs="Arial"/>
+          <w:color w:val="000000"/>
+          <w:sz w:val="24"/>
+          <w:szCs w:val="24"/>
+        </w:rPr>
+        <w:t>aparatelor</w:t>
+      </w:r>
+      <w:proofErr w:type="spellEnd"/>
+      <w:r>
+        <w:rPr>
+          <w:rFonts w:ascii="Arial" w:hAnsi="Arial" w:cs="Arial"/>
+          <w:color w:val="000000"/>
+          <w:sz w:val="24"/>
+          <w:szCs w:val="24"/>
+        </w:rPr>
+        <w:t xml:space="preserve"> </w:t>
+      </w:r>
+      <w:proofErr w:type="spellStart"/>
+      <w:r>
+        <w:rPr>
+          <w:rFonts w:ascii="Arial" w:hAnsi="Arial" w:cs="Arial"/>
+          <w:color w:val="000000"/>
+          <w:sz w:val="24"/>
+          <w:szCs w:val="24"/>
+        </w:rPr>
+        <w:t>electronice</w:t>
+      </w:r>
+      <w:proofErr w:type="spellEnd"/>
+      <w:r>
+        <w:rPr>
+          <w:rFonts w:ascii="Arial" w:hAnsi="Arial" w:cs="Arial"/>
+          <w:color w:val="000000"/>
+          <w:sz w:val="24"/>
+          <w:szCs w:val="24"/>
+        </w:rPr>
+        <w:t xml:space="preserve"> de </w:t>
+      </w:r>
+      <w:proofErr w:type="spellStart"/>
+      <w:r>
+        <w:rPr>
+          <w:rFonts w:ascii="Arial" w:hAnsi="Arial" w:cs="Arial"/>
+          <w:color w:val="000000"/>
+          <w:sz w:val="24"/>
+          <w:szCs w:val="24"/>
+        </w:rPr>
+        <w:t>marcat</w:t>
+      </w:r>
+      <w:proofErr w:type="spellEnd"/>
+      <w:r>
+        <w:rPr>
+          <w:rFonts w:ascii="Arial" w:hAnsi="Arial" w:cs="Arial"/>
+          <w:color w:val="000000"/>
+          <w:sz w:val="24"/>
+          <w:szCs w:val="24"/>
+        </w:rPr>
+        <w:t xml:space="preserve"> </w:t>
+      </w:r>
+      <w:proofErr w:type="spellStart"/>
+      <w:r>
+        <w:rPr>
+          <w:rFonts w:ascii="Arial" w:hAnsi="Arial" w:cs="Arial"/>
+          <w:color w:val="000000"/>
+          <w:sz w:val="24"/>
+          <w:szCs w:val="24"/>
+        </w:rPr>
+        <w:t>fiscale</w:t>
+      </w:r>
+      <w:proofErr w:type="spellEnd"/>
     </w:p>
     <w:p>
       <w:pPr>
@@ -151,14 +233,25 @@
           <w:szCs w:val="24"/>
         </w:rPr>
       </w:pPr>
-      <w:r>
-        <w:rPr>
-          <w:rFonts w:ascii="Arial" w:hAnsi="Arial" w:cs="Arial"/>
-          <w:color w:val="000000"/>
-          <w:sz w:val="24"/>
-          <w:szCs w:val="24"/>
-        </w:rPr>
-        <w:t>Organul fiscal teritorial</w:t>
+      <w:proofErr w:type="spellStart"/>
+      <w:r>
+        <w:rPr>
+          <w:rFonts w:ascii="Arial" w:hAnsi="Arial" w:cs="Arial"/>
+          <w:color w:val="000000"/>
+          <w:sz w:val="24"/>
+          <w:szCs w:val="24"/>
+        </w:rPr>
+        <w:t>Organul</w:t>
+      </w:r>
+      <w:proofErr w:type="spellEnd"/>
+      <w:r>
+        <w:rPr>
+          <w:rFonts w:ascii="Arial" w:hAnsi="Arial" w:cs="Arial"/>
+          <w:color w:val="000000"/>
+          <w:sz w:val="24"/>
+          <w:szCs w:val="24"/>
+        </w:rPr>
+        <w:t xml:space="preserve"> fiscal teritorial</w:t>
       </w:r>
     </w:p>
     <w:p>
@@ -229,15 +322,77 @@
           <w:szCs w:val="24"/>
         </w:rPr>
       </w:pPr>
-      <w:r>
-        <w:rPr>
-          <w:rFonts w:ascii="Arial" w:hAnsi="Arial" w:cs="Arial"/>
-          <w:color w:val="000000"/>
-          <w:sz w:val="24"/>
-          <w:szCs w:val="24"/>
-        </w:rPr>
-        <w:t>Numarul si data inregistarii declaratiei</w:t>
-      </w:r>
+      <w:proofErr w:type="spellStart"/>
+      <w:r>
+        <w:rPr>
+          <w:rFonts w:ascii="Arial" w:hAnsi="Arial" w:cs="Arial"/>
+          <w:color w:val="000000"/>
+          <w:sz w:val="24"/>
+          <w:szCs w:val="24"/>
+        </w:rPr>
+        <w:t>Numarul</w:t>
+      </w:r>
+      <w:proofErr w:type="spellEnd"/>
+      <w:r>
+        <w:rPr>
+          <w:rFonts w:ascii="Arial" w:hAnsi="Arial" w:cs="Arial"/>
+          <w:color w:val="000000"/>
+          <w:sz w:val="24"/>
+          <w:szCs w:val="24"/>
+        </w:rPr>
+        <w:t xml:space="preserve"> </w:t>
+      </w:r>
+      <w:proofErr w:type="spellStart"/>
+      <w:r>
+        <w:rPr>
+          <w:rFonts w:ascii="Arial" w:hAnsi="Arial" w:cs="Arial"/>
+          <w:color w:val="000000"/>
+          <w:sz w:val="24"/>
+          <w:szCs w:val="24"/>
+        </w:rPr>
+        <w:t>si</w:t>
+      </w:r>
+      <w:proofErr w:type="spellEnd"/>
+      <w:r>
+        <w:rPr>
+          <w:rFonts w:ascii="Arial" w:hAnsi="Arial" w:cs="Arial"/>
+          <w:color w:val="000000"/>
+          <w:sz w:val="24"/>
+          <w:szCs w:val="24"/>
+        </w:rPr>
+        <w:t xml:space="preserve"> data </w:t>
+      </w:r>
+      <w:proofErr w:type="spellStart"/>
+      <w:r>
+        <w:rPr>
+          <w:rFonts w:ascii="Arial" w:hAnsi="Arial" w:cs="Arial"/>
+          <w:color w:val="000000"/>
+          <w:sz w:val="24"/>
+          <w:szCs w:val="24"/>
+        </w:rPr>
+        <w:t>inregistarii</w:t>
+      </w:r>
+      <w:proofErr w:type="spellEnd"/>
+      <w:r>
+        <w:rPr>
+          <w:rFonts w:ascii="Arial" w:hAnsi="Arial" w:cs="Arial"/>
+          <w:color w:val="000000"/>
+          <w:sz w:val="24"/>
+          <w:szCs w:val="24"/>
+        </w:rPr>
+        <w:t xml:space="preserve"> </w:t>
+      </w:r>
+      <w:proofErr w:type="spellStart"/>
+      <w:r>
+        <w:rPr>
+          <w:rFonts w:ascii="Arial" w:hAnsi="Arial" w:cs="Arial"/>
+          <w:color w:val="000000"/>
+          <w:sz w:val="24"/>
+          <w:szCs w:val="24"/>
+        </w:rPr>
+        <w:t>declaratiei</w:t>
+      </w:r>
+      <w:proofErr w:type="spellEnd"/>
     </w:p>
     <w:p>
       <w:pPr>
@@ -280,7 +435,7 @@
     </w:p>
     <w:p>
       <w:pPr>
-        <w:framePr w:w="10313" w:h="8416" w:hRule="exact" w:wrap="auto" w:vAnchor="page" w:hAnchor="page" w:x="736" w:y="4186"/>
+        <w:framePr w:w="10313" w:h="7376" w:hRule="exact" w:wrap="auto" w:vAnchor="page" w:hAnchor="page" w:x="736" w:y="4186"/>
         <w:widowControl w:val="0"/>
         <w:tabs>
           <w:tab w:val="left" w:pos="360"/>
@@ -344,15 +499,47 @@
         </w:rPr>
         <w:tab/>
       </w:r>
-      <w:r>
-        <w:rPr>
-          <w:rFonts w:ascii="Arial" w:hAnsi="Arial" w:cs="Arial"/>
-          <w:color w:val="000000"/>
-          <w:sz w:val="24"/>
-          <w:szCs w:val="24"/>
-        </w:rPr>
-        <w:t xml:space="preserve">Subsemnatul  {Administrator}, in calitate de </w:t>
-      </w:r>
+      <w:proofErr w:type="spellStart"/>
+      <w:r>
+        <w:rPr>
+          <w:rFonts w:ascii="Arial" w:hAnsi="Arial" w:cs="Arial"/>
+          <w:color w:val="000000"/>
+          <w:sz w:val="24"/>
+          <w:szCs w:val="24"/>
+        </w:rPr>
+        <w:t>Subsemnatul</w:t>
+      </w:r>
+      <w:proofErr w:type="spellEnd"/>
+      <w:r>
+        <w:rPr>
+          <w:rFonts w:ascii="Arial" w:hAnsi="Arial" w:cs="Arial"/>
+          <w:color w:val="000000"/>
+          <w:sz w:val="24"/>
+          <w:szCs w:val="24"/>
+        </w:rPr>
+        <w:t xml:space="preserve">  {Administrator}, in </w:t>
+      </w:r>
+      <w:proofErr w:type="spellStart"/>
+      <w:r>
+        <w:rPr>
+          <w:rFonts w:ascii="Arial" w:hAnsi="Arial" w:cs="Arial"/>
+          <w:color w:val="000000"/>
+          <w:sz w:val="24"/>
+          <w:szCs w:val="24"/>
+        </w:rPr>
+        <w:t>calitate</w:t>
+      </w:r>
+      <w:proofErr w:type="spellEnd"/>
+      <w:r>
+        <w:rPr>
+          <w:rFonts w:ascii="Arial" w:hAnsi="Arial" w:cs="Arial"/>
+          <w:color w:val="000000"/>
+          <w:sz w:val="24"/>
+          <w:szCs w:val="24"/>
+        </w:rPr>
+        <w:t xml:space="preserve"> de </w:t>
+      </w:r>
+      <w:proofErr w:type="spellStart"/>
       <w:r>
         <w:rPr>
           <w:rFonts w:ascii="Arial" w:hAnsi="Arial" w:cs="Arial"/>
@@ -363,6 +550,7 @@
         </w:rPr>
         <w:t>Reprezentant</w:t>
       </w:r>
+      <w:proofErr w:type="spellEnd"/>
       <w:r>
         <w:rPr>
           <w:rFonts w:ascii="Arial" w:hAnsi="Arial" w:cs="Arial"/>
@@ -380,7 +568,17 @@
           <w:sz w:val="24"/>
           <w:szCs w:val="24"/>
         </w:rPr>
-        <w:t>la {Nume</w:t>
+        <w:t>la {</w:t>
+      </w:r>
+      <w:proofErr w:type="spellStart"/>
+      <w:r>
+        <w:rPr>
+          <w:rFonts w:ascii="Arial" w:hAnsi="Arial" w:cs="Arial"/>
+          <w:color w:val="000000"/>
+          <w:sz w:val="24"/>
+          <w:szCs w:val="24"/>
+        </w:rPr>
+        <w:t>Nume</w:t>
       </w:r>
       <w:r>
         <w:rPr>
@@ -398,8 +596,39 @@
           <w:sz w:val="24"/>
           <w:szCs w:val="24"/>
         </w:rPr>
-        <w:t>Firma}, cu sediul in: {</w:t>
-      </w:r>
+        <w:t>Firma</w:t>
+      </w:r>
+      <w:proofErr w:type="spellEnd"/>
+      <w:r>
+        <w:rPr>
+          <w:rFonts w:ascii="Arial" w:hAnsi="Arial" w:cs="Arial"/>
+          <w:color w:val="000000"/>
+          <w:sz w:val="24"/>
+          <w:szCs w:val="24"/>
+        </w:rPr>
+        <w:t xml:space="preserve">}, cu </w:t>
+      </w:r>
+      <w:proofErr w:type="spellStart"/>
+      <w:r>
+        <w:rPr>
+          <w:rFonts w:ascii="Arial" w:hAnsi="Arial" w:cs="Arial"/>
+          <w:color w:val="000000"/>
+          <w:sz w:val="24"/>
+          <w:szCs w:val="24"/>
+        </w:rPr>
+        <w:t>sediul</w:t>
+      </w:r>
+      <w:proofErr w:type="spellEnd"/>
+      <w:r>
+        <w:rPr>
+          <w:rFonts w:ascii="Arial" w:hAnsi="Arial" w:cs="Arial"/>
+          <w:color w:val="000000"/>
+          <w:sz w:val="24"/>
+          <w:szCs w:val="24"/>
+        </w:rPr>
+        <w:t xml:space="preserve"> in: {</w:t>
+      </w:r>
+      <w:proofErr w:type="spellStart"/>
       <w:r>
         <w:rPr>
           <w:rFonts w:ascii="Arial" w:hAnsi="Arial" w:cs="Arial"/>
@@ -409,6 +638,7 @@
         </w:rPr>
         <w:t>Sediu_Social</w:t>
       </w:r>
+      <w:proofErr w:type="spellEnd"/>
       <w:r>
         <w:rPr>
           <w:rFonts w:ascii="Arial" w:hAnsi="Arial" w:cs="Arial"/>
@@ -418,24 +648,17 @@
         </w:rPr>
         <w:t xml:space="preserve">}, </w:t>
       </w:r>
-      <w:r>
-        <w:rPr>
-          <w:rFonts w:ascii="Arial" w:hAnsi="Arial" w:cs="Arial"/>
-          <w:color w:val="000000"/>
-          <w:sz w:val="24"/>
-          <w:szCs w:val="24"/>
-        </w:rPr>
-        <w:t xml:space="preserve">avand codul fiscal {Cui}, </w:t>
-      </w:r>
-      <w:r>
-        <w:rPr>
-          <w:rFonts w:ascii="Arial" w:hAnsi="Arial" w:cs="Arial"/>
-          <w:color w:val="000000"/>
-          <w:sz w:val="24"/>
-          <w:szCs w:val="24"/>
-        </w:rPr>
-        <w:t xml:space="preserve"> declar ca am instalat la data de</w:t>
-      </w:r>
+      <w:proofErr w:type="spellStart"/>
+      <w:r>
+        <w:rPr>
+          <w:rFonts w:ascii="Arial" w:hAnsi="Arial" w:cs="Arial"/>
+          <w:color w:val="000000"/>
+          <w:sz w:val="24"/>
+          <w:szCs w:val="24"/>
+        </w:rPr>
+        <w:t>avand</w:t>
+      </w:r>
+      <w:proofErr w:type="spellEnd"/>
       <w:r>
         <w:rPr>
           <w:rFonts w:ascii="Arial" w:hAnsi="Arial" w:cs="Arial"/>
@@ -445,6 +668,26 @@
         </w:rPr>
         <w:t xml:space="preserve"> </w:t>
       </w:r>
+      <w:proofErr w:type="spellStart"/>
+      <w:r>
+        <w:rPr>
+          <w:rFonts w:ascii="Arial" w:hAnsi="Arial" w:cs="Arial"/>
+          <w:color w:val="000000"/>
+          <w:sz w:val="24"/>
+          <w:szCs w:val="24"/>
+        </w:rPr>
+        <w:t>codul</w:t>
+      </w:r>
+      <w:proofErr w:type="spellEnd"/>
+      <w:r>
+        <w:rPr>
+          <w:rFonts w:ascii="Arial" w:hAnsi="Arial" w:cs="Arial"/>
+          <w:color w:val="000000"/>
+          <w:sz w:val="24"/>
+          <w:szCs w:val="24"/>
+        </w:rPr>
+        <w:t xml:space="preserve"> fiscal {Cui}, </w:t>
+      </w:r>
       <w:r>
         <w:rPr>
           <w:rFonts w:ascii="Arial" w:hAnsi="Arial" w:cs="Arial"/>
@@ -454,6 +697,64 @@
         </w:rPr>
         <w:t xml:space="preserve"> </w:t>
       </w:r>
+      <w:proofErr w:type="spellStart"/>
+      <w:r>
+        <w:rPr>
+          <w:rFonts w:ascii="Arial" w:hAnsi="Arial" w:cs="Arial"/>
+          <w:color w:val="000000"/>
+          <w:sz w:val="24"/>
+          <w:szCs w:val="24"/>
+        </w:rPr>
+        <w:t>declar</w:t>
+      </w:r>
+      <w:proofErr w:type="spellEnd"/>
+      <w:r>
+        <w:rPr>
+          <w:rFonts w:ascii="Arial" w:hAnsi="Arial" w:cs="Arial"/>
+          <w:color w:val="000000"/>
+          <w:sz w:val="24"/>
+          <w:szCs w:val="24"/>
+        </w:rPr>
+        <w:t xml:space="preserve"> ca am </w:t>
+      </w:r>
+      <w:proofErr w:type="spellStart"/>
+      <w:r>
+        <w:rPr>
+          <w:rFonts w:ascii="Arial" w:hAnsi="Arial" w:cs="Arial"/>
+          <w:color w:val="000000"/>
+          <w:sz w:val="24"/>
+          <w:szCs w:val="24"/>
+        </w:rPr>
+        <w:t>instalat</w:t>
+      </w:r>
+      <w:proofErr w:type="spellEnd"/>
+      <w:r>
+        <w:rPr>
+          <w:rFonts w:ascii="Arial" w:hAnsi="Arial" w:cs="Arial"/>
+          <w:color w:val="000000"/>
+          <w:sz w:val="24"/>
+          <w:szCs w:val="24"/>
+        </w:rPr>
+        <w:t xml:space="preserve"> la data de</w:t>
+      </w:r>
+      <w:r>
+        <w:rPr>
+          <w:rFonts w:ascii="Arial" w:hAnsi="Arial" w:cs="Arial"/>
+          <w:color w:val="000000"/>
+          <w:sz w:val="24"/>
+          <w:szCs w:val="24"/>
+        </w:rPr>
+        <w:t xml:space="preserve"> </w:t>
+      </w:r>
+      <w:r>
+        <w:rPr>
+          <w:rFonts w:ascii="Arial" w:hAnsi="Arial" w:cs="Arial"/>
+          <w:color w:val="000000"/>
+          <w:sz w:val="24"/>
+          <w:szCs w:val="24"/>
+        </w:rPr>
+        <w:t xml:space="preserve"> </w:t>
+      </w:r>
       <w:r>
         <w:rPr>
           <w:rFonts w:ascii="Arial" w:hAnsi="Arial" w:cs="Arial"/>
@@ -470,7 +771,47 @@
           <w:sz w:val="24"/>
           <w:szCs w:val="24"/>
         </w:rPr>
-        <w:t xml:space="preserve"> la punctul de lucru din</w:t>
+        <w:t xml:space="preserve"> la </w:t>
+      </w:r>
+      <w:proofErr w:type="spellStart"/>
+      <w:r>
+        <w:rPr>
+          <w:rFonts w:ascii="Arial" w:hAnsi="Arial" w:cs="Arial"/>
+          <w:color w:val="000000"/>
+          <w:sz w:val="24"/>
+          <w:szCs w:val="24"/>
+        </w:rPr>
+        <w:t>punctul</w:t>
+      </w:r>
+      <w:proofErr w:type="spellEnd"/>
+      <w:r>
+        <w:rPr>
+          <w:rFonts w:ascii="Arial" w:hAnsi="Arial" w:cs="Arial"/>
+          <w:color w:val="000000"/>
+          <w:sz w:val="24"/>
+          <w:szCs w:val="24"/>
+        </w:rPr>
+        <w:t xml:space="preserve"> de </w:t>
+      </w:r>
+      <w:proofErr w:type="spellStart"/>
+      <w:r>
+        <w:rPr>
+          <w:rFonts w:ascii="Arial" w:hAnsi="Arial" w:cs="Arial"/>
+          <w:color w:val="000000"/>
+          <w:sz w:val="24"/>
+          <w:szCs w:val="24"/>
+        </w:rPr>
+        <w:t>lucru</w:t>
+      </w:r>
+      <w:proofErr w:type="spellEnd"/>
+      <w:r>
+        <w:rPr>
+          <w:rFonts w:ascii="Arial" w:hAnsi="Arial" w:cs="Arial"/>
+          <w:color w:val="000000"/>
+          <w:sz w:val="24"/>
+          <w:szCs w:val="24"/>
+        </w:rPr>
+        <w:t xml:space="preserve"> din</w:t>
       </w:r>
       <w:r>
         <w:rPr>
@@ -488,7 +829,17 @@
           <w:sz w:val="24"/>
           <w:szCs w:val="24"/>
         </w:rPr>
-        <w:t xml:space="preserve"> {Punct</w:t>
+        <w:t xml:space="preserve"> {</w:t>
+      </w:r>
+      <w:proofErr w:type="spellStart"/>
+      <w:r>
+        <w:rPr>
+          <w:rFonts w:ascii="Arial" w:hAnsi="Arial" w:cs="Arial"/>
+          <w:color w:val="000000"/>
+          <w:sz w:val="24"/>
+          <w:szCs w:val="24"/>
+        </w:rPr>
+        <w:t>Punct</w:t>
       </w:r>
       <w:r>
         <w:rPr>
@@ -506,30 +857,162 @@
           <w:sz w:val="24"/>
           <w:szCs w:val="24"/>
         </w:rPr>
-        <w:t xml:space="preserve">Lucru}, un numar de 1 aparat de marcat electronic fiscal, avand </w:t>
-      </w:r>
-      <w:r>
-        <w:rPr>
-          <w:rFonts w:ascii="Arial" w:hAnsi="Arial" w:cs="Arial"/>
-          <w:color w:val="000000"/>
-          <w:sz w:val="24"/>
-          <w:szCs w:val="24"/>
-        </w:rPr>
-        <w:t xml:space="preserve">urmatoarele </w:t>
-      </w:r>
-      <w:r>
-        <w:rPr>
-          <w:rFonts w:ascii="Arial" w:hAnsi="Arial" w:cs="Arial"/>
-          <w:color w:val="000000"/>
-          <w:sz w:val="24"/>
-          <w:szCs w:val="24"/>
-        </w:rPr>
-        <w:t>elementele de identificare:</w:t>
+        <w:t>Lucru</w:t>
+      </w:r>
+      <w:proofErr w:type="spellEnd"/>
+      <w:r>
+        <w:rPr>
+          <w:rFonts w:ascii="Arial" w:hAnsi="Arial" w:cs="Arial"/>
+          <w:color w:val="000000"/>
+          <w:sz w:val="24"/>
+          <w:szCs w:val="24"/>
+        </w:rPr>
+        <w:t xml:space="preserve">}, un </w:t>
+      </w:r>
+      <w:proofErr w:type="spellStart"/>
+      <w:r>
+        <w:rPr>
+          <w:rFonts w:ascii="Arial" w:hAnsi="Arial" w:cs="Arial"/>
+          <w:color w:val="000000"/>
+          <w:sz w:val="24"/>
+          <w:szCs w:val="24"/>
+        </w:rPr>
+        <w:t>numar</w:t>
+      </w:r>
+      <w:proofErr w:type="spellEnd"/>
+      <w:r>
+        <w:rPr>
+          <w:rFonts w:ascii="Arial" w:hAnsi="Arial" w:cs="Arial"/>
+          <w:color w:val="000000"/>
+          <w:sz w:val="24"/>
+          <w:szCs w:val="24"/>
+        </w:rPr>
+        <w:t xml:space="preserve"> de 1 </w:t>
+      </w:r>
+      <w:proofErr w:type="spellStart"/>
+      <w:r>
+        <w:rPr>
+          <w:rFonts w:ascii="Arial" w:hAnsi="Arial" w:cs="Arial"/>
+          <w:color w:val="000000"/>
+          <w:sz w:val="24"/>
+          <w:szCs w:val="24"/>
+        </w:rPr>
+        <w:t>aparat</w:t>
+      </w:r>
+      <w:proofErr w:type="spellEnd"/>
+      <w:r>
+        <w:rPr>
+          <w:rFonts w:ascii="Arial" w:hAnsi="Arial" w:cs="Arial"/>
+          <w:color w:val="000000"/>
+          <w:sz w:val="24"/>
+          <w:szCs w:val="24"/>
+        </w:rPr>
+        <w:t xml:space="preserve"> de </w:t>
+      </w:r>
+      <w:proofErr w:type="spellStart"/>
+      <w:r>
+        <w:rPr>
+          <w:rFonts w:ascii="Arial" w:hAnsi="Arial" w:cs="Arial"/>
+          <w:color w:val="000000"/>
+          <w:sz w:val="24"/>
+          <w:szCs w:val="24"/>
+        </w:rPr>
+        <w:t>marcat</w:t>
+      </w:r>
+      <w:proofErr w:type="spellEnd"/>
+      <w:r>
+        <w:rPr>
+          <w:rFonts w:ascii="Arial" w:hAnsi="Arial" w:cs="Arial"/>
+          <w:color w:val="000000"/>
+          <w:sz w:val="24"/>
+          <w:szCs w:val="24"/>
+        </w:rPr>
+        <w:t xml:space="preserve"> electronic fiscal, </w:t>
+      </w:r>
+      <w:proofErr w:type="spellStart"/>
+      <w:r>
+        <w:rPr>
+          <w:rFonts w:ascii="Arial" w:hAnsi="Arial" w:cs="Arial"/>
+          <w:color w:val="000000"/>
+          <w:sz w:val="24"/>
+          <w:szCs w:val="24"/>
+        </w:rPr>
+        <w:t>avand</w:t>
+      </w:r>
+      <w:proofErr w:type="spellEnd"/>
+      <w:r>
+        <w:rPr>
+          <w:rFonts w:ascii="Arial" w:hAnsi="Arial" w:cs="Arial"/>
+          <w:color w:val="000000"/>
+          <w:sz w:val="24"/>
+          <w:szCs w:val="24"/>
+        </w:rPr>
+        <w:t xml:space="preserve"> </w:t>
+      </w:r>
+      <w:proofErr w:type="spellStart"/>
+      <w:r>
+        <w:rPr>
+          <w:rFonts w:ascii="Arial" w:hAnsi="Arial" w:cs="Arial"/>
+          <w:color w:val="000000"/>
+          <w:sz w:val="24"/>
+          <w:szCs w:val="24"/>
+        </w:rPr>
+        <w:t>urmatoarele</w:t>
+      </w:r>
+      <w:proofErr w:type="spellEnd"/>
+      <w:r>
+        <w:rPr>
+          <w:rFonts w:ascii="Arial" w:hAnsi="Arial" w:cs="Arial"/>
+          <w:color w:val="000000"/>
+          <w:sz w:val="24"/>
+          <w:szCs w:val="24"/>
+        </w:rPr>
+        <w:t xml:space="preserve"> </w:t>
+      </w:r>
+      <w:proofErr w:type="spellStart"/>
+      <w:r>
+        <w:rPr>
+          <w:rFonts w:ascii="Arial" w:hAnsi="Arial" w:cs="Arial"/>
+          <w:color w:val="000000"/>
+          <w:sz w:val="24"/>
+          <w:szCs w:val="24"/>
+        </w:rPr>
+        <w:t>elementele</w:t>
+      </w:r>
+      <w:proofErr w:type="spellEnd"/>
+      <w:r>
+        <w:rPr>
+          <w:rFonts w:ascii="Arial" w:hAnsi="Arial" w:cs="Arial"/>
+          <w:color w:val="000000"/>
+          <w:sz w:val="24"/>
+          <w:szCs w:val="24"/>
+        </w:rPr>
+        <w:t xml:space="preserve"> de </w:t>
+      </w:r>
+      <w:proofErr w:type="spellStart"/>
+      <w:r>
+        <w:rPr>
+          <w:rFonts w:ascii="Arial" w:hAnsi="Arial" w:cs="Arial"/>
+          <w:color w:val="000000"/>
+          <w:sz w:val="24"/>
+          <w:szCs w:val="24"/>
+        </w:rPr>
+        <w:t>identificare</w:t>
+      </w:r>
+      <w:proofErr w:type="spellEnd"/>
+      <w:r>
+        <w:rPr>
+          <w:rFonts w:ascii="Arial" w:hAnsi="Arial" w:cs="Arial"/>
+          <w:color w:val="000000"/>
+          <w:sz w:val="24"/>
+          <w:szCs w:val="24"/>
+        </w:rPr>
+        <w:t>:</w:t>
       </w:r>
     </w:p>
     <w:p>
       <w:pPr>
-        <w:framePr w:w="10313" w:h="8416" w:hRule="exact" w:wrap="auto" w:vAnchor="page" w:hAnchor="page" w:x="736" w:y="4186"/>
+        <w:framePr w:w="10313" w:h="7376" w:hRule="exact" w:wrap="auto" w:vAnchor="page" w:hAnchor="page" w:x="736" w:y="4186"/>
         <w:widowControl w:val="0"/>
         <w:tabs>
           <w:tab w:val="left" w:pos="360"/>
@@ -578,7 +1061,7 @@
     </w:p>
     <w:p>
       <w:pPr>
-        <w:framePr w:w="10313" w:h="8416" w:hRule="exact" w:wrap="auto" w:vAnchor="page" w:hAnchor="page" w:x="736" w:y="4186"/>
+        <w:framePr w:w="10313" w:h="7376" w:hRule="exact" w:wrap="auto" w:vAnchor="page" w:hAnchor="page" w:x="736" w:y="4186"/>
         <w:widowControl w:val="0"/>
         <w:tabs>
           <w:tab w:val="left" w:pos="360"/>
@@ -627,7 +1110,7 @@
     </w:p>
     <w:p>
       <w:pPr>
-        <w:framePr w:w="10313" w:h="8416" w:hRule="exact" w:wrap="auto" w:vAnchor="page" w:hAnchor="page" w:x="736" w:y="4186"/>
+        <w:framePr w:w="10313" w:h="7376" w:hRule="exact" w:wrap="auto" w:vAnchor="page" w:hAnchor="page" w:x="736" w:y="4186"/>
         <w:widowControl w:val="0"/>
         <w:tabs>
           <w:tab w:val="left" w:pos="360"/>
@@ -691,14 +1174,35 @@
         </w:rPr>
         <w:t xml:space="preserve"> </w:t>
       </w:r>
-      <w:r>
-        <w:rPr>
-          <w:rFonts w:ascii="Arial" w:hAnsi="Arial" w:cs="Arial"/>
-          <w:color w:val="000000"/>
-          <w:sz w:val="24"/>
-          <w:szCs w:val="24"/>
-        </w:rPr>
-        <w:t>Amef: {Model</w:t>
+      <w:proofErr w:type="spellStart"/>
+      <w:r>
+        <w:rPr>
+          <w:rFonts w:ascii="Arial" w:hAnsi="Arial" w:cs="Arial"/>
+          <w:color w:val="000000"/>
+          <w:sz w:val="24"/>
+          <w:szCs w:val="24"/>
+        </w:rPr>
+        <w:t>Amef</w:t>
+      </w:r>
+      <w:proofErr w:type="spellEnd"/>
+      <w:r>
+        <w:rPr>
+          <w:rFonts w:ascii="Arial" w:hAnsi="Arial" w:cs="Arial"/>
+          <w:color w:val="000000"/>
+          <w:sz w:val="24"/>
+          <w:szCs w:val="24"/>
+        </w:rPr>
+        <w:t>: {</w:t>
+      </w:r>
+      <w:proofErr w:type="spellStart"/>
+      <w:r>
+        <w:rPr>
+          <w:rFonts w:ascii="Arial" w:hAnsi="Arial" w:cs="Arial"/>
+          <w:color w:val="000000"/>
+          <w:sz w:val="24"/>
+          <w:szCs w:val="24"/>
+        </w:rPr>
+        <w:t>Model</w:t>
       </w:r>
       <w:r>
         <w:rPr>
@@ -716,12 +1220,22 @@
           <w:sz w:val="24"/>
           <w:szCs w:val="24"/>
         </w:rPr>
-        <w:t>Amef}</w:t>
+        <w:t>Amef</w:t>
+      </w:r>
+      <w:proofErr w:type="spellEnd"/>
+      <w:r>
+        <w:rPr>
+          <w:rFonts w:ascii="Arial" w:hAnsi="Arial" w:cs="Arial"/>
+          <w:color w:val="000000"/>
+          <w:sz w:val="24"/>
+          <w:szCs w:val="24"/>
+        </w:rPr>
+        <w:t>}</w:t>
       </w:r>
     </w:p>
     <w:p>
       <w:pPr>
-        <w:framePr w:w="10313" w:h="8416" w:hRule="exact" w:wrap="auto" w:vAnchor="page" w:hAnchor="page" w:x="736" w:y="4186"/>
+        <w:framePr w:w="10313" w:h="7376" w:hRule="exact" w:wrap="auto" w:vAnchor="page" w:hAnchor="page" w:x="736" w:y="4186"/>
         <w:widowControl w:val="0"/>
         <w:tabs>
           <w:tab w:val="left" w:pos="360"/>
@@ -785,14 +1299,35 @@
         </w:rPr>
         <w:t xml:space="preserve"> </w:t>
       </w:r>
-      <w:r>
-        <w:rPr>
-          <w:rFonts w:ascii="Arial" w:hAnsi="Arial" w:cs="Arial"/>
-          <w:color w:val="000000"/>
-          <w:sz w:val="24"/>
-          <w:szCs w:val="24"/>
-        </w:rPr>
-        <w:t>Amef: {Serie</w:t>
+      <w:proofErr w:type="spellStart"/>
+      <w:r>
+        <w:rPr>
+          <w:rFonts w:ascii="Arial" w:hAnsi="Arial" w:cs="Arial"/>
+          <w:color w:val="000000"/>
+          <w:sz w:val="24"/>
+          <w:szCs w:val="24"/>
+        </w:rPr>
+        <w:t>Amef</w:t>
+      </w:r>
+      <w:proofErr w:type="spellEnd"/>
+      <w:r>
+        <w:rPr>
+          <w:rFonts w:ascii="Arial" w:hAnsi="Arial" w:cs="Arial"/>
+          <w:color w:val="000000"/>
+          <w:sz w:val="24"/>
+          <w:szCs w:val="24"/>
+        </w:rPr>
+        <w:t>: {</w:t>
+      </w:r>
+      <w:proofErr w:type="spellStart"/>
+      <w:r>
+        <w:rPr>
+          <w:rFonts w:ascii="Arial" w:hAnsi="Arial" w:cs="Arial"/>
+          <w:color w:val="000000"/>
+          <w:sz w:val="24"/>
+          <w:szCs w:val="24"/>
+        </w:rPr>
+        <w:t>Serie</w:t>
       </w:r>
       <w:r>
         <w:rPr>
@@ -810,12 +1345,22 @@
           <w:sz w:val="24"/>
           <w:szCs w:val="24"/>
         </w:rPr>
-        <w:t>Amef}</w:t>
+        <w:t>Amef</w:t>
+      </w:r>
+      <w:proofErr w:type="spellEnd"/>
+      <w:r>
+        <w:rPr>
+          <w:rFonts w:ascii="Arial" w:hAnsi="Arial" w:cs="Arial"/>
+          <w:color w:val="000000"/>
+          <w:sz w:val="24"/>
+          <w:szCs w:val="24"/>
+        </w:rPr>
+        <w:t>}</w:t>
       </w:r>
     </w:p>
     <w:p>
       <w:pPr>
-        <w:framePr w:w="10313" w:h="8416" w:hRule="exact" w:wrap="auto" w:vAnchor="page" w:hAnchor="page" w:x="736" w:y="4186"/>
+        <w:framePr w:w="10313" w:h="7376" w:hRule="exact" w:wrap="auto" w:vAnchor="page" w:hAnchor="page" w:x="736" w:y="4186"/>
         <w:widowControl w:val="0"/>
         <w:tabs>
           <w:tab w:val="left" w:pos="360"/>
@@ -868,12 +1413,32 @@
           <w:sz w:val="24"/>
           <w:szCs w:val="24"/>
         </w:rPr>
-        <w:t>Nui Amef: {Nui}</w:t>
+        <w:t xml:space="preserve">Nui </w:t>
+      </w:r>
+      <w:proofErr w:type="spellStart"/>
+      <w:r>
+        <w:rPr>
+          <w:rFonts w:ascii="Arial" w:hAnsi="Arial" w:cs="Arial"/>
+          <w:color w:val="000000"/>
+          <w:sz w:val="24"/>
+          <w:szCs w:val="24"/>
+        </w:rPr>
+        <w:t>Amef</w:t>
+      </w:r>
+      <w:proofErr w:type="spellEnd"/>
+      <w:r>
+        <w:rPr>
+          <w:rFonts w:ascii="Arial" w:hAnsi="Arial" w:cs="Arial"/>
+          <w:color w:val="000000"/>
+          <w:sz w:val="24"/>
+          <w:szCs w:val="24"/>
+        </w:rPr>
+        <w:t>: {Nui}</w:t>
       </w:r>
     </w:p>
     <w:p>
       <w:pPr>
-        <w:framePr w:w="10313" w:h="8416" w:hRule="exact" w:wrap="auto" w:vAnchor="page" w:hAnchor="page" w:x="736" w:y="4186"/>
+        <w:framePr w:w="10313" w:h="7376" w:hRule="exact" w:wrap="auto" w:vAnchor="page" w:hAnchor="page" w:x="736" w:y="4186"/>
         <w:widowControl w:val="0"/>
         <w:tabs>
           <w:tab w:val="left" w:pos="360"/>
@@ -922,7 +1487,7 @@
     </w:p>
     <w:p>
       <w:pPr>
-        <w:framePr w:w="10313" w:h="8416" w:hRule="exact" w:wrap="auto" w:vAnchor="page" w:hAnchor="page" w:x="736" w:y="4186"/>
+        <w:framePr w:w="10313" w:h="7376" w:hRule="exact" w:wrap="auto" w:vAnchor="page" w:hAnchor="page" w:x="736" w:y="4186"/>
         <w:widowControl w:val="0"/>
         <w:tabs>
           <w:tab w:val="left" w:pos="360"/>
@@ -971,7 +1536,7 @@
     </w:p>
     <w:p>
       <w:pPr>
-        <w:framePr w:w="10313" w:h="8416" w:hRule="exact" w:wrap="auto" w:vAnchor="page" w:hAnchor="page" w:x="736" w:y="4186"/>
+        <w:framePr w:w="10313" w:h="7376" w:hRule="exact" w:wrap="auto" w:vAnchor="page" w:hAnchor="page" w:x="736" w:y="4186"/>
         <w:widowControl w:val="0"/>
         <w:tabs>
           <w:tab w:val="left" w:pos="360"/>
@@ -1034,8 +1599,39 @@
           <w:szCs w:val="24"/>
         </w:rPr>
         <w:tab/>
-        <w:t>Data achizitionarii aparatului</w:t>
-      </w:r>
+        <w:t xml:space="preserve">Data </w:t>
+      </w:r>
+      <w:proofErr w:type="spellStart"/>
+      <w:r>
+        <w:rPr>
+          <w:rFonts w:ascii="Arial" w:hAnsi="Arial" w:cs="Arial"/>
+          <w:color w:val="000000"/>
+          <w:sz w:val="24"/>
+          <w:szCs w:val="24"/>
+        </w:rPr>
+        <w:t>achizitionarii</w:t>
+      </w:r>
+      <w:proofErr w:type="spellEnd"/>
+      <w:r>
+        <w:rPr>
+          <w:rFonts w:ascii="Arial" w:hAnsi="Arial" w:cs="Arial"/>
+          <w:color w:val="000000"/>
+          <w:sz w:val="24"/>
+          <w:szCs w:val="24"/>
+        </w:rPr>
+        <w:t xml:space="preserve"> </w:t>
+      </w:r>
+      <w:proofErr w:type="spellStart"/>
+      <w:r>
+        <w:rPr>
+          <w:rFonts w:ascii="Arial" w:hAnsi="Arial" w:cs="Arial"/>
+          <w:color w:val="000000"/>
+          <w:sz w:val="24"/>
+          <w:szCs w:val="24"/>
+        </w:rPr>
+        <w:t>aparatului</w:t>
+      </w:r>
+      <w:proofErr w:type="spellEnd"/>
       <w:r>
         <w:rPr>
           <w:rFonts w:ascii="Arial" w:hAnsi="Arial" w:cs="Arial"/>
@@ -1052,12 +1648,32 @@
           <w:sz w:val="24"/>
           <w:szCs w:val="24"/>
         </w:rPr>
-        <w:t>{Data_Achizitionare}.</w:t>
+        <w:t>{</w:t>
+      </w:r>
+      <w:proofErr w:type="spellStart"/>
+      <w:r>
+        <w:rPr>
+          <w:rFonts w:ascii="Arial" w:hAnsi="Arial" w:cs="Arial"/>
+          <w:color w:val="000000"/>
+          <w:sz w:val="24"/>
+          <w:szCs w:val="24"/>
+        </w:rPr>
+        <w:t>Data_Achizitionare</w:t>
+      </w:r>
+      <w:proofErr w:type="spellEnd"/>
+      <w:r>
+        <w:rPr>
+          <w:rFonts w:ascii="Arial" w:hAnsi="Arial" w:cs="Arial"/>
+          <w:color w:val="000000"/>
+          <w:sz w:val="24"/>
+          <w:szCs w:val="24"/>
+        </w:rPr>
+        <w:t>}.</w:t>
       </w:r>
     </w:p>
     <w:p>
       <w:pPr>
-        <w:framePr w:w="10313" w:h="8416" w:hRule="exact" w:wrap="auto" w:vAnchor="page" w:hAnchor="page" w:x="736" w:y="4186"/>
+        <w:framePr w:w="10313" w:h="7376" w:hRule="exact" w:wrap="auto" w:vAnchor="page" w:hAnchor="page" w:x="736" w:y="4186"/>
         <w:widowControl w:val="0"/>
         <w:tabs>
           <w:tab w:val="left" w:pos="360"/>
@@ -1106,7 +1722,7 @@
     </w:p>
     <w:p>
       <w:pPr>
-        <w:framePr w:w="10313" w:h="8416" w:hRule="exact" w:wrap="auto" w:vAnchor="page" w:hAnchor="page" w:x="736" w:y="4186"/>
+        <w:framePr w:w="10313" w:h="7376" w:hRule="exact" w:wrap="auto" w:vAnchor="page" w:hAnchor="page" w:x="736" w:y="4186"/>
         <w:widowControl w:val="0"/>
         <w:tabs>
           <w:tab w:val="left" w:pos="360"/>
@@ -1169,7 +1785,236 @@
           <w:szCs w:val="24"/>
         </w:rPr>
         <w:tab/>
-        <w:t>Numarul / data avizului Comisiei de avizare a distributiei si utilizarii aparatelor de marcat electronice fiscale: {Aviz_Dist</w:t>
+      </w:r>
+      <w:proofErr w:type="spellStart"/>
+      <w:r>
+        <w:rPr>
+          <w:rFonts w:ascii="Arial" w:hAnsi="Arial" w:cs="Arial"/>
+          <w:color w:val="000000"/>
+          <w:sz w:val="24"/>
+          <w:szCs w:val="24"/>
+        </w:rPr>
+        <w:t>Numarul</w:t>
+      </w:r>
+      <w:proofErr w:type="spellEnd"/>
+      <w:r>
+        <w:rPr>
+          <w:rFonts w:ascii="Arial" w:hAnsi="Arial" w:cs="Arial"/>
+          <w:color w:val="000000"/>
+          <w:sz w:val="24"/>
+          <w:szCs w:val="24"/>
+        </w:rPr>
+        <w:t xml:space="preserve"> / data </w:t>
+      </w:r>
+      <w:proofErr w:type="spellStart"/>
+      <w:r>
+        <w:rPr>
+          <w:rFonts w:ascii="Arial" w:hAnsi="Arial" w:cs="Arial"/>
+          <w:color w:val="000000"/>
+          <w:sz w:val="24"/>
+          <w:szCs w:val="24"/>
+        </w:rPr>
+        <w:t>avizului</w:t>
+      </w:r>
+      <w:proofErr w:type="spellEnd"/>
+      <w:r>
+        <w:rPr>
+          <w:rFonts w:ascii="Arial" w:hAnsi="Arial" w:cs="Arial"/>
+          <w:color w:val="000000"/>
+          <w:sz w:val="24"/>
+          <w:szCs w:val="24"/>
+        </w:rPr>
+        <w:t xml:space="preserve"> </w:t>
+      </w:r>
+      <w:proofErr w:type="spellStart"/>
+      <w:r>
+        <w:rPr>
+          <w:rFonts w:ascii="Arial" w:hAnsi="Arial" w:cs="Arial"/>
+          <w:color w:val="000000"/>
+          <w:sz w:val="24"/>
+          <w:szCs w:val="24"/>
+        </w:rPr>
+        <w:t>Comisiei</w:t>
+      </w:r>
+      <w:proofErr w:type="spellEnd"/>
+      <w:r>
+        <w:rPr>
+          <w:rFonts w:ascii="Arial" w:hAnsi="Arial" w:cs="Arial"/>
+          <w:color w:val="000000"/>
+          <w:sz w:val="24"/>
+          <w:szCs w:val="24"/>
+        </w:rPr>
+        <w:t xml:space="preserve"> de </w:t>
+      </w:r>
+      <w:proofErr w:type="spellStart"/>
+      <w:r>
+        <w:rPr>
+          <w:rFonts w:ascii="Arial" w:hAnsi="Arial" w:cs="Arial"/>
+          <w:color w:val="000000"/>
+          <w:sz w:val="24"/>
+          <w:szCs w:val="24"/>
+        </w:rPr>
+        <w:t>avizare</w:t>
+      </w:r>
+      <w:proofErr w:type="spellEnd"/>
+      <w:r>
+        <w:rPr>
+          <w:rFonts w:ascii="Arial" w:hAnsi="Arial" w:cs="Arial"/>
+          <w:color w:val="000000"/>
+          <w:sz w:val="24"/>
+          <w:szCs w:val="24"/>
+        </w:rPr>
+        <w:t xml:space="preserve"> a </w:t>
+      </w:r>
+      <w:proofErr w:type="spellStart"/>
+      <w:r>
+        <w:rPr>
+          <w:rFonts w:ascii="Arial" w:hAnsi="Arial" w:cs="Arial"/>
+          <w:color w:val="000000"/>
+          <w:sz w:val="24"/>
+          <w:szCs w:val="24"/>
+        </w:rPr>
+        <w:t>distributiei</w:t>
+      </w:r>
+      <w:proofErr w:type="spellEnd"/>
+      <w:r>
+        <w:rPr>
+          <w:rFonts w:ascii="Arial" w:hAnsi="Arial" w:cs="Arial"/>
+          <w:color w:val="000000"/>
+          <w:sz w:val="24"/>
+          <w:szCs w:val="24"/>
+        </w:rPr>
+        <w:t xml:space="preserve"> </w:t>
+      </w:r>
+      <w:proofErr w:type="spellStart"/>
+      <w:r>
+        <w:rPr>
+          <w:rFonts w:ascii="Arial" w:hAnsi="Arial" w:cs="Arial"/>
+          <w:color w:val="000000"/>
+          <w:sz w:val="24"/>
+          <w:szCs w:val="24"/>
+        </w:rPr>
+        <w:t>si</w:t>
+      </w:r>
+      <w:proofErr w:type="spellEnd"/>
+      <w:r>
+        <w:rPr>
+          <w:rFonts w:ascii="Arial" w:hAnsi="Arial" w:cs="Arial"/>
+          <w:color w:val="000000"/>
+          <w:sz w:val="24"/>
+          <w:szCs w:val="24"/>
+        </w:rPr>
+        <w:t xml:space="preserve"> </w:t>
+      </w:r>
+      <w:proofErr w:type="spellStart"/>
+      <w:r>
+        <w:rPr>
+          <w:rFonts w:ascii="Arial" w:hAnsi="Arial" w:cs="Arial"/>
+          <w:color w:val="000000"/>
+          <w:sz w:val="24"/>
+          <w:szCs w:val="24"/>
+        </w:rPr>
+        <w:t>utilizarii</w:t>
+      </w:r>
+      <w:proofErr w:type="spellEnd"/>
+      <w:r>
+        <w:rPr>
+          <w:rFonts w:ascii="Arial" w:hAnsi="Arial" w:cs="Arial"/>
+          <w:color w:val="000000"/>
+          <w:sz w:val="24"/>
+          <w:szCs w:val="24"/>
+        </w:rPr>
+        <w:t xml:space="preserve"> </w:t>
+      </w:r>
+      <w:proofErr w:type="spellStart"/>
+      <w:r>
+        <w:rPr>
+          <w:rFonts w:ascii="Arial" w:hAnsi="Arial" w:cs="Arial"/>
+          <w:color w:val="000000"/>
+          <w:sz w:val="24"/>
+          <w:szCs w:val="24"/>
+        </w:rPr>
+        <w:t>aparatelor</w:t>
+      </w:r>
+      <w:proofErr w:type="spellEnd"/>
+      <w:r>
+        <w:rPr>
+          <w:rFonts w:ascii="Arial" w:hAnsi="Arial" w:cs="Arial"/>
+          <w:color w:val="000000"/>
+          <w:sz w:val="24"/>
+          <w:szCs w:val="24"/>
+        </w:rPr>
+        <w:t xml:space="preserve"> de </w:t>
+      </w:r>
+      <w:proofErr w:type="spellStart"/>
+      <w:r>
+        <w:rPr>
+          <w:rFonts w:ascii="Arial" w:hAnsi="Arial" w:cs="Arial"/>
+          <w:color w:val="000000"/>
+          <w:sz w:val="24"/>
+          <w:szCs w:val="24"/>
+        </w:rPr>
+        <w:t>marcat</w:t>
+      </w:r>
+      <w:proofErr w:type="spellEnd"/>
+      <w:r>
+        <w:rPr>
+          <w:rFonts w:ascii="Arial" w:hAnsi="Arial" w:cs="Arial"/>
+          <w:color w:val="000000"/>
+          <w:sz w:val="24"/>
+          <w:szCs w:val="24"/>
+        </w:rPr>
+        <w:t xml:space="preserve"> </w:t>
+      </w:r>
+      <w:proofErr w:type="spellStart"/>
+      <w:r>
+        <w:rPr>
+          <w:rFonts w:ascii="Arial" w:hAnsi="Arial" w:cs="Arial"/>
+          <w:color w:val="000000"/>
+          <w:sz w:val="24"/>
+          <w:szCs w:val="24"/>
+        </w:rPr>
+        <w:t>electronice</w:t>
+      </w:r>
+      <w:proofErr w:type="spellEnd"/>
+      <w:r>
+        <w:rPr>
+          <w:rFonts w:ascii="Arial" w:hAnsi="Arial" w:cs="Arial"/>
+          <w:color w:val="000000"/>
+          <w:sz w:val="24"/>
+          <w:szCs w:val="24"/>
+        </w:rPr>
+        <w:t xml:space="preserve"> </w:t>
+      </w:r>
+      <w:proofErr w:type="spellStart"/>
+      <w:r>
+        <w:rPr>
+          <w:rFonts w:ascii="Arial" w:hAnsi="Arial" w:cs="Arial"/>
+          <w:color w:val="000000"/>
+          <w:sz w:val="24"/>
+          <w:szCs w:val="24"/>
+        </w:rPr>
+        <w:t>fiscale</w:t>
+      </w:r>
+      <w:proofErr w:type="spellEnd"/>
+      <w:r>
+        <w:rPr>
+          <w:rFonts w:ascii="Arial" w:hAnsi="Arial" w:cs="Arial"/>
+          <w:color w:val="000000"/>
+          <w:sz w:val="24"/>
+          <w:szCs w:val="24"/>
+        </w:rPr>
+        <w:t>: {</w:t>
+      </w:r>
+      <w:proofErr w:type="spellStart"/>
+      <w:r>
+        <w:rPr>
+          <w:rFonts w:ascii="Arial" w:hAnsi="Arial" w:cs="Arial"/>
+          <w:color w:val="000000"/>
+          <w:sz w:val="24"/>
+          <w:szCs w:val="24"/>
+        </w:rPr>
+        <w:t>Aviz_Dist</w:t>
       </w:r>
       <w:r>
         <w:rPr>
@@ -1187,12 +2032,42 @@
           <w:sz w:val="24"/>
           <w:szCs w:val="24"/>
         </w:rPr>
-        <w:t>ibutie} din {Data_Aviz}</w:t>
+        <w:t>ibutie</w:t>
+      </w:r>
+      <w:proofErr w:type="spellEnd"/>
+      <w:r>
+        <w:rPr>
+          <w:rFonts w:ascii="Arial" w:hAnsi="Arial" w:cs="Arial"/>
+          <w:color w:val="000000"/>
+          <w:sz w:val="24"/>
+          <w:szCs w:val="24"/>
+        </w:rPr>
+        <w:t>} din {</w:t>
+      </w:r>
+      <w:proofErr w:type="spellStart"/>
+      <w:r>
+        <w:rPr>
+          <w:rFonts w:ascii="Arial" w:hAnsi="Arial" w:cs="Arial"/>
+          <w:color w:val="000000"/>
+          <w:sz w:val="24"/>
+          <w:szCs w:val="24"/>
+        </w:rPr>
+        <w:t>Data_Aviz</w:t>
+      </w:r>
+      <w:proofErr w:type="spellEnd"/>
+      <w:r>
+        <w:rPr>
+          <w:rFonts w:ascii="Arial" w:hAnsi="Arial" w:cs="Arial"/>
+          <w:color w:val="000000"/>
+          <w:sz w:val="24"/>
+          <w:szCs w:val="24"/>
+        </w:rPr>
+        <w:t>}</w:t>
       </w:r>
     </w:p>
     <w:p>
       <w:pPr>
-        <w:framePr w:w="10313" w:h="8416" w:hRule="exact" w:wrap="auto" w:vAnchor="page" w:hAnchor="page" w:x="736" w:y="4186"/>
+        <w:framePr w:w="10313" w:h="7376" w:hRule="exact" w:wrap="auto" w:vAnchor="page" w:hAnchor="page" w:x="736" w:y="4186"/>
         <w:widowControl w:val="0"/>
         <w:tabs>
           <w:tab w:val="left" w:pos="360"/>
@@ -1241,7 +2116,7 @@
     </w:p>
     <w:p>
       <w:pPr>
-        <w:framePr w:w="10313" w:h="8416" w:hRule="exact" w:wrap="auto" w:vAnchor="page" w:hAnchor="page" w:x="736" w:y="4186"/>
+        <w:framePr w:w="10313" w:h="7376" w:hRule="exact" w:wrap="auto" w:vAnchor="page" w:hAnchor="page" w:x="736" w:y="4186"/>
         <w:widowControl w:val="0"/>
         <w:tabs>
           <w:tab w:val="left" w:pos="360"/>
@@ -1304,7 +2179,46 @@
           <w:szCs w:val="24"/>
         </w:rPr>
         <w:tab/>
-        <w:t>Sigilarea imprimantei s</w:t>
+      </w:r>
+      <w:proofErr w:type="spellStart"/>
+      <w:r>
+        <w:rPr>
+          <w:rFonts w:ascii="Arial" w:hAnsi="Arial" w:cs="Arial"/>
+          <w:color w:val="000000"/>
+          <w:sz w:val="24"/>
+          <w:szCs w:val="24"/>
+        </w:rPr>
+        <w:t>Sigilarea</w:t>
+      </w:r>
+      <w:proofErr w:type="spellEnd"/>
+      <w:r>
+        <w:rPr>
+          <w:rFonts w:ascii="Arial" w:hAnsi="Arial" w:cs="Arial"/>
+          <w:color w:val="000000"/>
+          <w:sz w:val="24"/>
+          <w:szCs w:val="24"/>
+        </w:rPr>
+        <w:t xml:space="preserve"> </w:t>
+      </w:r>
+      <w:proofErr w:type="spellStart"/>
+      <w:r>
+        <w:rPr>
+          <w:rFonts w:ascii="Arial" w:hAnsi="Arial" w:cs="Arial"/>
+          <w:color w:val="000000"/>
+          <w:sz w:val="24"/>
+          <w:szCs w:val="24"/>
+        </w:rPr>
+        <w:t>imprimantei</w:t>
+      </w:r>
+      <w:proofErr w:type="spellEnd"/>
+      <w:r>
+        <w:rPr>
+          <w:rFonts w:ascii="Arial" w:hAnsi="Arial" w:cs="Arial"/>
+          <w:color w:val="000000"/>
+          <w:sz w:val="24"/>
+          <w:szCs w:val="24"/>
+        </w:rPr>
+        <w:t xml:space="preserve"> s</w:t>
       </w:r>
       <w:r>
         <w:rPr>
@@ -1314,8 +2228,49 @@
           <w:szCs w:val="24"/>
         </w:rPr>
         <w:noBreakHyphen/>
-        <w:t>a efectuat cu sigiliul {</w:t>
-      </w:r>
+        <w:t xml:space="preserve">a </w:t>
+      </w:r>
+      <w:proofErr w:type="spellStart"/>
+      <w:r>
+        <w:rPr>
+          <w:rFonts w:ascii="Arial" w:hAnsi="Arial" w:cs="Arial"/>
+          <w:color w:val="000000"/>
+          <w:sz w:val="24"/>
+          <w:szCs w:val="24"/>
+        </w:rPr>
+        <w:t>efectuat</w:t>
+      </w:r>
+      <w:proofErr w:type="spellEnd"/>
+      <w:r>
+        <w:rPr>
+          <w:rFonts w:ascii="Arial" w:hAnsi="Arial" w:cs="Arial"/>
+          <w:color w:val="000000"/>
+          <w:sz w:val="24"/>
+          <w:szCs w:val="24"/>
+        </w:rPr>
+        <w:t xml:space="preserve"> cu </w:t>
+      </w:r>
+      <w:proofErr w:type="spellStart"/>
+      <w:r>
+        <w:rPr>
+          <w:rFonts w:ascii="Arial" w:hAnsi="Arial" w:cs="Arial"/>
+          <w:color w:val="000000"/>
+          <w:sz w:val="24"/>
+          <w:szCs w:val="24"/>
+        </w:rPr>
+        <w:t>sigiliul</w:t>
+      </w:r>
+      <w:proofErr w:type="spellEnd"/>
+      <w:r>
+        <w:rPr>
+          <w:rFonts w:ascii="Arial" w:hAnsi="Arial" w:cs="Arial"/>
+          <w:color w:val="000000"/>
+          <w:sz w:val="24"/>
+          <w:szCs w:val="24"/>
+        </w:rPr>
+        <w:t xml:space="preserve"> {</w:t>
+      </w:r>
+      <w:proofErr w:type="spellStart"/>
       <w:r>
         <w:rPr>
           <w:rFonts w:ascii="Arial" w:hAnsi="Arial" w:cs="Arial"/>
@@ -1332,7 +2287,57 @@
           <w:sz w:val="24"/>
           <w:szCs w:val="24"/>
         </w:rPr>
-        <w:t xml:space="preserve">igiliu}, aplicat pe memoria fiscala a </w:t>
+        <w:t>igiliu</w:t>
+      </w:r>
+      <w:proofErr w:type="spellEnd"/>
+      <w:r>
+        <w:rPr>
+          <w:rFonts w:ascii="Arial" w:hAnsi="Arial" w:cs="Arial"/>
+          <w:color w:val="000000"/>
+          <w:sz w:val="24"/>
+          <w:szCs w:val="24"/>
+        </w:rPr>
+        <w:t xml:space="preserve">}, </w:t>
+      </w:r>
+      <w:proofErr w:type="spellStart"/>
+      <w:r>
+        <w:rPr>
+          <w:rFonts w:ascii="Arial" w:hAnsi="Arial" w:cs="Arial"/>
+          <w:color w:val="000000"/>
+          <w:sz w:val="24"/>
+          <w:szCs w:val="24"/>
+        </w:rPr>
+        <w:t>aplicat</w:t>
+      </w:r>
+      <w:proofErr w:type="spellEnd"/>
+      <w:r>
+        <w:rPr>
+          <w:rFonts w:ascii="Arial" w:hAnsi="Arial" w:cs="Arial"/>
+          <w:color w:val="000000"/>
+          <w:sz w:val="24"/>
+          <w:szCs w:val="24"/>
+        </w:rPr>
+        <w:t xml:space="preserve"> pe memoria </w:t>
+      </w:r>
+      <w:proofErr w:type="spellStart"/>
+      <w:r>
+        <w:rPr>
+          <w:rFonts w:ascii="Arial" w:hAnsi="Arial" w:cs="Arial"/>
+          <w:color w:val="000000"/>
+          <w:sz w:val="24"/>
+          <w:szCs w:val="24"/>
+        </w:rPr>
+        <w:t>fiscala</w:t>
+      </w:r>
+      <w:proofErr w:type="spellEnd"/>
+      <w:r>
+        <w:rPr>
+          <w:rFonts w:ascii="Arial" w:hAnsi="Arial" w:cs="Arial"/>
+          <w:color w:val="000000"/>
+          <w:sz w:val="24"/>
+          <w:szCs w:val="24"/>
+        </w:rPr>
+        <w:t xml:space="preserve"> a </w:t>
       </w:r>
       <w:r>
         <w:rPr>
@@ -1350,12 +2355,72 @@
           <w:sz w:val="24"/>
           <w:szCs w:val="24"/>
         </w:rPr>
-        <w:t xml:space="preserve"> cat si pe carcasa acesteia.</w:t>
+        <w:t xml:space="preserve"> cat </w:t>
+      </w:r>
+      <w:proofErr w:type="spellStart"/>
+      <w:r>
+        <w:rPr>
+          <w:rFonts w:ascii="Arial" w:hAnsi="Arial" w:cs="Arial"/>
+          <w:color w:val="000000"/>
+          <w:sz w:val="24"/>
+          <w:szCs w:val="24"/>
+        </w:rPr>
+        <w:t>si</w:t>
+      </w:r>
+      <w:proofErr w:type="spellEnd"/>
+      <w:r>
+        <w:rPr>
+          <w:rFonts w:ascii="Arial" w:hAnsi="Arial" w:cs="Arial"/>
+          <w:color w:val="000000"/>
+          <w:sz w:val="24"/>
+          <w:szCs w:val="24"/>
+        </w:rPr>
+        <w:t xml:space="preserve"> pe </w:t>
+      </w:r>
+      <w:proofErr w:type="spellStart"/>
+      <w:r>
+        <w:rPr>
+          <w:rFonts w:ascii="Arial" w:hAnsi="Arial" w:cs="Arial"/>
+          <w:color w:val="000000"/>
+          <w:sz w:val="24"/>
+          <w:szCs w:val="24"/>
+        </w:rPr>
+        <w:t>carcasa</w:t>
+      </w:r>
+      <w:proofErr w:type="spellEnd"/>
+      <w:r>
+        <w:rPr>
+          <w:rFonts w:ascii="Arial" w:hAnsi="Arial" w:cs="Arial"/>
+          <w:color w:val="000000"/>
+          <w:sz w:val="24"/>
+          <w:szCs w:val="24"/>
+        </w:rPr>
+        <w:t xml:space="preserve"> </w:t>
+      </w:r>
+      <w:proofErr w:type="spellStart"/>
+      <w:r>
+        <w:rPr>
+          <w:rFonts w:ascii="Arial" w:hAnsi="Arial" w:cs="Arial"/>
+          <w:color w:val="000000"/>
+          <w:sz w:val="24"/>
+          <w:szCs w:val="24"/>
+        </w:rPr>
+        <w:t>acesteia</w:t>
+      </w:r>
+      <w:proofErr w:type="spellEnd"/>
+      <w:r>
+        <w:rPr>
+          <w:rFonts w:ascii="Arial" w:hAnsi="Arial" w:cs="Arial"/>
+          <w:color w:val="000000"/>
+          <w:sz w:val="24"/>
+          <w:szCs w:val="24"/>
+        </w:rPr>
+        <w:t>.</w:t>
       </w:r>
     </w:p>
     <w:p>
       <w:pPr>
-        <w:framePr w:w="10313" w:h="8416" w:hRule="exact" w:wrap="auto" w:vAnchor="page" w:hAnchor="page" w:x="736" w:y="4186"/>
+        <w:framePr w:w="10313" w:h="7376" w:hRule="exact" w:wrap="auto" w:vAnchor="page" w:hAnchor="page" w:x="736" w:y="4186"/>
         <w:widowControl w:val="0"/>
         <w:tabs>
           <w:tab w:val="left" w:pos="360"/>
@@ -1404,7 +2469,7 @@
     </w:p>
     <w:p>
       <w:pPr>
-        <w:framePr w:w="10313" w:h="8416" w:hRule="exact" w:wrap="auto" w:vAnchor="page" w:hAnchor="page" w:x="736" w:y="4186"/>
+        <w:framePr w:w="10313" w:h="7376" w:hRule="exact" w:wrap="auto" w:vAnchor="page" w:hAnchor="page" w:x="736" w:y="4186"/>
         <w:widowControl w:val="0"/>
         <w:tabs>
           <w:tab w:val="left" w:pos="360"/>
@@ -1467,8 +2532,148 @@
           <w:szCs w:val="24"/>
         </w:rPr>
         <w:tab/>
-        <w:t>Instalarea a fost efectuata de tehnicianul: {Tehnician}, avand legitimatia nr {</w:t>
-      </w:r>
+      </w:r>
+      <w:proofErr w:type="spellStart"/>
+      <w:r>
+        <w:rPr>
+          <w:rFonts w:ascii="Arial" w:hAnsi="Arial" w:cs="Arial"/>
+          <w:color w:val="000000"/>
+          <w:sz w:val="24"/>
+          <w:szCs w:val="24"/>
+        </w:rPr>
+        <w:t>Instalarea</w:t>
+      </w:r>
+      <w:proofErr w:type="spellEnd"/>
+      <w:r>
+        <w:rPr>
+          <w:rFonts w:ascii="Arial" w:hAnsi="Arial" w:cs="Arial"/>
+          <w:color w:val="000000"/>
+          <w:sz w:val="24"/>
+          <w:szCs w:val="24"/>
+        </w:rPr>
+        <w:t xml:space="preserve"> a </w:t>
+      </w:r>
+      <w:proofErr w:type="spellStart"/>
+      <w:r>
+        <w:rPr>
+          <w:rFonts w:ascii="Arial" w:hAnsi="Arial" w:cs="Arial"/>
+          <w:color w:val="000000"/>
+          <w:sz w:val="24"/>
+          <w:szCs w:val="24"/>
+        </w:rPr>
+        <w:t>fost</w:t>
+      </w:r>
+      <w:proofErr w:type="spellEnd"/>
+      <w:r>
+        <w:rPr>
+          <w:rFonts w:ascii="Arial" w:hAnsi="Arial" w:cs="Arial"/>
+          <w:color w:val="000000"/>
+          <w:sz w:val="24"/>
+          <w:szCs w:val="24"/>
+        </w:rPr>
+        <w:t xml:space="preserve"> </w:t>
+      </w:r>
+      <w:proofErr w:type="spellStart"/>
+      <w:r>
+        <w:rPr>
+          <w:rFonts w:ascii="Arial" w:hAnsi="Arial" w:cs="Arial"/>
+          <w:color w:val="000000"/>
+          <w:sz w:val="24"/>
+          <w:szCs w:val="24"/>
+        </w:rPr>
+        <w:t>efectuata</w:t>
+      </w:r>
+      <w:proofErr w:type="spellEnd"/>
+      <w:r>
+        <w:rPr>
+          <w:rFonts w:ascii="Arial" w:hAnsi="Arial" w:cs="Arial"/>
+          <w:color w:val="000000"/>
+          <w:sz w:val="24"/>
+          <w:szCs w:val="24"/>
+        </w:rPr>
+        <w:t xml:space="preserve"> de </w:t>
+      </w:r>
+      <w:proofErr w:type="spellStart"/>
+      <w:r>
+        <w:rPr>
+          <w:rFonts w:ascii="Arial" w:hAnsi="Arial" w:cs="Arial"/>
+          <w:color w:val="000000"/>
+          <w:sz w:val="24"/>
+          <w:szCs w:val="24"/>
+        </w:rPr>
+        <w:t>tehnicianul</w:t>
+      </w:r>
+      <w:proofErr w:type="spellEnd"/>
+      <w:r>
+        <w:rPr>
+          <w:rFonts w:ascii="Arial" w:hAnsi="Arial" w:cs="Arial"/>
+          <w:color w:val="000000"/>
+          <w:sz w:val="24"/>
+          <w:szCs w:val="24"/>
+        </w:rPr>
+        <w:t>: {</w:t>
+      </w:r>
+      <w:proofErr w:type="spellStart"/>
+      <w:r>
+        <w:rPr>
+          <w:rFonts w:ascii="Arial" w:hAnsi="Arial" w:cs="Arial"/>
+          <w:color w:val="000000"/>
+          <w:sz w:val="24"/>
+          <w:szCs w:val="24"/>
+        </w:rPr>
+        <w:t>Tehnician</w:t>
+      </w:r>
+      <w:proofErr w:type="spellEnd"/>
+      <w:r>
+        <w:rPr>
+          <w:rFonts w:ascii="Arial" w:hAnsi="Arial" w:cs="Arial"/>
+          <w:color w:val="000000"/>
+          <w:sz w:val="24"/>
+          <w:szCs w:val="24"/>
+        </w:rPr>
+        <w:t xml:space="preserve">}, </w:t>
+      </w:r>
+      <w:proofErr w:type="spellStart"/>
+      <w:r>
+        <w:rPr>
+          <w:rFonts w:ascii="Arial" w:hAnsi="Arial" w:cs="Arial"/>
+          <w:color w:val="000000"/>
+          <w:sz w:val="24"/>
+          <w:szCs w:val="24"/>
+        </w:rPr>
+        <w:t>avand</w:t>
+      </w:r>
+      <w:proofErr w:type="spellEnd"/>
+      <w:r>
+        <w:rPr>
+          <w:rFonts w:ascii="Arial" w:hAnsi="Arial" w:cs="Arial"/>
+          <w:color w:val="000000"/>
+          <w:sz w:val="24"/>
+          <w:szCs w:val="24"/>
+        </w:rPr>
+        <w:t xml:space="preserve"> </w:t>
+      </w:r>
+      <w:proofErr w:type="spellStart"/>
+      <w:r>
+        <w:rPr>
+          <w:rFonts w:ascii="Arial" w:hAnsi="Arial" w:cs="Arial"/>
+          <w:color w:val="000000"/>
+          <w:sz w:val="24"/>
+          <w:szCs w:val="24"/>
+        </w:rPr>
+        <w:t>legitimatia</w:t>
+      </w:r>
+      <w:proofErr w:type="spellEnd"/>
+      <w:r>
+        <w:rPr>
+          <w:rFonts w:ascii="Arial" w:hAnsi="Arial" w:cs="Arial"/>
+          <w:color w:val="000000"/>
+          <w:sz w:val="24"/>
+          <w:szCs w:val="24"/>
+        </w:rPr>
+        <w:t xml:space="preserve"> nr {</w:t>
+      </w:r>
+      <w:proofErr w:type="spellStart"/>
       <w:r>
         <w:rPr>
           <w:rFonts w:ascii="Arial" w:hAnsi="Arial" w:cs="Arial"/>
@@ -1485,30 +2690,240 @@
           <w:sz w:val="24"/>
           <w:szCs w:val="24"/>
         </w:rPr>
-        <w:t xml:space="preserve">egitimatie}, numarul de identificare </w:t>
-      </w:r>
-      <w:r>
-        <w:rPr>
-          <w:rFonts w:ascii="Arial" w:hAnsi="Arial" w:cs="Arial"/>
-          <w:color w:val="000000"/>
-          <w:sz w:val="24"/>
-          <w:szCs w:val="24"/>
-        </w:rPr>
-        <w:t>{Sigiliu}</w:t>
-      </w:r>
-      <w:r>
-        <w:rPr>
-          <w:rFonts w:ascii="Arial" w:hAnsi="Arial" w:cs="Arial"/>
-          <w:color w:val="000000"/>
-          <w:sz w:val="24"/>
-          <w:szCs w:val="24"/>
-        </w:rPr>
-        <w:t xml:space="preserve"> de la unitatea service SC SECRET DATA SRL, avand sediul in Judetul / sectorul SATU MARE, strada AVRAM IANCU, nr. 17, cod fiscal RO9740584, telefon: 0261.768.038</w:t>
+        <w:t>egitimatie</w:t>
+      </w:r>
+      <w:proofErr w:type="spellEnd"/>
+      <w:r>
+        <w:rPr>
+          <w:rFonts w:ascii="Arial" w:hAnsi="Arial" w:cs="Arial"/>
+          <w:color w:val="000000"/>
+          <w:sz w:val="24"/>
+          <w:szCs w:val="24"/>
+        </w:rPr>
+        <w:t xml:space="preserve">}, </w:t>
+      </w:r>
+      <w:proofErr w:type="spellStart"/>
+      <w:r>
+        <w:rPr>
+          <w:rFonts w:ascii="Arial" w:hAnsi="Arial" w:cs="Arial"/>
+          <w:color w:val="000000"/>
+          <w:sz w:val="24"/>
+          <w:szCs w:val="24"/>
+        </w:rPr>
+        <w:t>numarul</w:t>
+      </w:r>
+      <w:proofErr w:type="spellEnd"/>
+      <w:r>
+        <w:rPr>
+          <w:rFonts w:ascii="Arial" w:hAnsi="Arial" w:cs="Arial"/>
+          <w:color w:val="000000"/>
+          <w:sz w:val="24"/>
+          <w:szCs w:val="24"/>
+        </w:rPr>
+        <w:t xml:space="preserve"> de </w:t>
+      </w:r>
+      <w:proofErr w:type="spellStart"/>
+      <w:r>
+        <w:rPr>
+          <w:rFonts w:ascii="Arial" w:hAnsi="Arial" w:cs="Arial"/>
+          <w:color w:val="000000"/>
+          <w:sz w:val="24"/>
+          <w:szCs w:val="24"/>
+        </w:rPr>
+        <w:t>identificare</w:t>
+      </w:r>
+      <w:proofErr w:type="spellEnd"/>
+      <w:r>
+        <w:rPr>
+          <w:rFonts w:ascii="Arial" w:hAnsi="Arial" w:cs="Arial"/>
+          <w:color w:val="000000"/>
+          <w:sz w:val="24"/>
+          <w:szCs w:val="24"/>
+        </w:rPr>
+        <w:t xml:space="preserve"> </w:t>
+      </w:r>
+      <w:r>
+        <w:rPr>
+          <w:rFonts w:ascii="Arial" w:hAnsi="Arial" w:cs="Arial"/>
+          <w:color w:val="000000"/>
+          <w:sz w:val="24"/>
+          <w:szCs w:val="24"/>
+        </w:rPr>
+        <w:t>{</w:t>
+      </w:r>
+      <w:proofErr w:type="spellStart"/>
+      <w:r>
+        <w:rPr>
+          <w:rFonts w:ascii="Arial" w:hAnsi="Arial" w:cs="Arial"/>
+          <w:color w:val="000000"/>
+          <w:sz w:val="24"/>
+          <w:szCs w:val="24"/>
+        </w:rPr>
+        <w:t>Sigiliu</w:t>
+      </w:r>
+      <w:proofErr w:type="spellEnd"/>
+      <w:r>
+        <w:rPr>
+          <w:rFonts w:ascii="Arial" w:hAnsi="Arial" w:cs="Arial"/>
+          <w:color w:val="000000"/>
+          <w:sz w:val="24"/>
+          <w:szCs w:val="24"/>
+        </w:rPr>
+        <w:t>}</w:t>
+      </w:r>
+      <w:r>
+        <w:rPr>
+          <w:rFonts w:ascii="Arial" w:hAnsi="Arial" w:cs="Arial"/>
+          <w:color w:val="000000"/>
+          <w:sz w:val="24"/>
+          <w:szCs w:val="24"/>
+        </w:rPr>
+        <w:t xml:space="preserve"> de la </w:t>
+      </w:r>
+      <w:proofErr w:type="spellStart"/>
+      <w:r>
+        <w:rPr>
+          <w:rFonts w:ascii="Arial" w:hAnsi="Arial" w:cs="Arial"/>
+          <w:color w:val="000000"/>
+          <w:sz w:val="24"/>
+          <w:szCs w:val="24"/>
+        </w:rPr>
+        <w:t>unitatea</w:t>
+      </w:r>
+      <w:proofErr w:type="spellEnd"/>
+      <w:r>
+        <w:rPr>
+          <w:rFonts w:ascii="Arial" w:hAnsi="Arial" w:cs="Arial"/>
+          <w:color w:val="000000"/>
+          <w:sz w:val="24"/>
+          <w:szCs w:val="24"/>
+        </w:rPr>
+        <w:t xml:space="preserve"> service SC SECRET DATA SRL, </w:t>
+      </w:r>
+      <w:proofErr w:type="spellStart"/>
+      <w:r>
+        <w:rPr>
+          <w:rFonts w:ascii="Arial" w:hAnsi="Arial" w:cs="Arial"/>
+          <w:color w:val="000000"/>
+          <w:sz w:val="24"/>
+          <w:szCs w:val="24"/>
+        </w:rPr>
+        <w:t>avand</w:t>
+      </w:r>
+      <w:proofErr w:type="spellEnd"/>
+      <w:r>
+        <w:rPr>
+          <w:rFonts w:ascii="Arial" w:hAnsi="Arial" w:cs="Arial"/>
+          <w:color w:val="000000"/>
+          <w:sz w:val="24"/>
+          <w:szCs w:val="24"/>
+        </w:rPr>
+        <w:t xml:space="preserve"> </w:t>
+      </w:r>
+      <w:proofErr w:type="spellStart"/>
+      <w:r>
+        <w:rPr>
+          <w:rFonts w:ascii="Arial" w:hAnsi="Arial" w:cs="Arial"/>
+          <w:color w:val="000000"/>
+          <w:sz w:val="24"/>
+          <w:szCs w:val="24"/>
+        </w:rPr>
+        <w:t>sediul</w:t>
+      </w:r>
+      <w:proofErr w:type="spellEnd"/>
+      <w:r>
+        <w:rPr>
+          <w:rFonts w:ascii="Arial" w:hAnsi="Arial" w:cs="Arial"/>
+          <w:color w:val="000000"/>
+          <w:sz w:val="24"/>
+          <w:szCs w:val="24"/>
+        </w:rPr>
+        <w:t xml:space="preserve"> in </w:t>
+      </w:r>
+      <w:proofErr w:type="spellStart"/>
+      <w:r>
+        <w:rPr>
+          <w:rFonts w:ascii="Arial" w:hAnsi="Arial" w:cs="Arial"/>
+          <w:color w:val="000000"/>
+          <w:sz w:val="24"/>
+          <w:szCs w:val="24"/>
+        </w:rPr>
+        <w:t>Judetul</w:t>
+      </w:r>
+      <w:proofErr w:type="spellEnd"/>
+      <w:r>
+        <w:rPr>
+          <w:rFonts w:ascii="Arial" w:hAnsi="Arial" w:cs="Arial"/>
+          <w:color w:val="000000"/>
+          <w:sz w:val="24"/>
+          <w:szCs w:val="24"/>
+        </w:rPr>
+        <w:t xml:space="preserve"> / </w:t>
+      </w:r>
+      <w:proofErr w:type="spellStart"/>
+      <w:r>
+        <w:rPr>
+          <w:rFonts w:ascii="Arial" w:hAnsi="Arial" w:cs="Arial"/>
+          <w:color w:val="000000"/>
+          <w:sz w:val="24"/>
+          <w:szCs w:val="24"/>
+        </w:rPr>
+        <w:t>sectorul</w:t>
+      </w:r>
+      <w:proofErr w:type="spellEnd"/>
+      <w:r>
+        <w:rPr>
+          <w:rFonts w:ascii="Arial" w:hAnsi="Arial" w:cs="Arial"/>
+          <w:color w:val="000000"/>
+          <w:sz w:val="24"/>
+          <w:szCs w:val="24"/>
+        </w:rPr>
+        <w:t xml:space="preserve"> SATU MARE, </w:t>
+      </w:r>
+      <w:proofErr w:type="spellStart"/>
+      <w:r>
+        <w:rPr>
+          <w:rFonts w:ascii="Arial" w:hAnsi="Arial" w:cs="Arial"/>
+          <w:color w:val="000000"/>
+          <w:sz w:val="24"/>
+          <w:szCs w:val="24"/>
+        </w:rPr>
+        <w:t>strada</w:t>
+      </w:r>
+      <w:proofErr w:type="spellEnd"/>
+      <w:r>
+        <w:rPr>
+          <w:rFonts w:ascii="Arial" w:hAnsi="Arial" w:cs="Arial"/>
+          <w:color w:val="000000"/>
+          <w:sz w:val="24"/>
+          <w:szCs w:val="24"/>
+        </w:rPr>
+        <w:t xml:space="preserve"> AVRAM IANCU, nr. 17, cod fiscal RO9740584, </w:t>
+      </w:r>
+      <w:proofErr w:type="spellStart"/>
+      <w:r>
+        <w:rPr>
+          <w:rFonts w:ascii="Arial" w:hAnsi="Arial" w:cs="Arial"/>
+          <w:color w:val="000000"/>
+          <w:sz w:val="24"/>
+          <w:szCs w:val="24"/>
+        </w:rPr>
+        <w:t>telefon</w:t>
+      </w:r>
+      <w:proofErr w:type="spellEnd"/>
+      <w:r>
+        <w:rPr>
+          <w:rFonts w:ascii="Arial" w:hAnsi="Arial" w:cs="Arial"/>
+          <w:color w:val="000000"/>
+          <w:sz w:val="24"/>
+          <w:szCs w:val="24"/>
+        </w:rPr>
+        <w:t>: 0261.768.038</w:t>
       </w:r>
     </w:p>
     <w:p>
       <w:pPr>
-        <w:framePr w:w="4470" w:h="1170" w:hRule="exact" w:wrap="auto" w:vAnchor="page" w:hAnchor="page" w:x="733" w:y="13153"/>
+        <w:framePr w:w="4470" w:h="1170" w:hRule="exact" w:wrap="auto" w:vAnchor="page" w:hAnchor="page" w:x="884" w:y="12339"/>
         <w:widowControl w:val="0"/>
         <w:tabs>
           <w:tab w:val="left" w:pos="360"/>
@@ -1535,6 +2950,7 @@
           <w:szCs w:val="24"/>
         </w:rPr>
       </w:pPr>
+      <w:proofErr w:type="spellStart"/>
       <w:r>
         <w:rPr>
           <w:rFonts w:ascii="Arial" w:hAnsi="Arial" w:cs="Arial"/>
@@ -1542,12 +2958,22 @@
           <w:sz w:val="23"/>
           <w:szCs w:val="24"/>
         </w:rPr>
-        <w:t>Societatea comerciala</w:t>
+        <w:t>Societatea</w:t>
+      </w:r>
+      <w:proofErr w:type="spellEnd"/>
+      <w:r>
+        <w:rPr>
+          <w:rFonts w:ascii="Arial" w:hAnsi="Arial" w:cs="Arial"/>
+          <w:color w:val="000000"/>
+          <w:sz w:val="23"/>
+          <w:szCs w:val="24"/>
+        </w:rPr>
+        <w:t xml:space="preserve"> comerciala</w:t>
       </w:r>
     </w:p>
     <w:p>
       <w:pPr>
-        <w:framePr w:w="4470" w:h="1170" w:hRule="exact" w:wrap="auto" w:vAnchor="page" w:hAnchor="page" w:x="733" w:y="13153"/>
+        <w:framePr w:w="4470" w:h="1170" w:hRule="exact" w:wrap="auto" w:vAnchor="page" w:hAnchor="page" w:x="884" w:y="12339"/>
         <w:widowControl w:val="0"/>
         <w:tabs>
           <w:tab w:val="left" w:pos="360"/>
@@ -1577,7 +3003,7 @@
     </w:p>
     <w:p>
       <w:pPr>
-        <w:framePr w:w="4470" w:h="1170" w:hRule="exact" w:wrap="auto" w:vAnchor="page" w:hAnchor="page" w:x="733" w:y="13153"/>
+        <w:framePr w:w="4470" w:h="1170" w:hRule="exact" w:wrap="auto" w:vAnchor="page" w:hAnchor="page" w:x="884" w:y="12339"/>
         <w:widowControl w:val="0"/>
         <w:tabs>
           <w:tab w:val="left" w:pos="360"/>
@@ -1604,6 +3030,7 @@
           <w:szCs w:val="24"/>
         </w:rPr>
       </w:pPr>
+      <w:proofErr w:type="spellStart"/>
       <w:r>
         <w:rPr>
           <w:rFonts w:ascii="Arial" w:hAnsi="Arial" w:cs="Arial"/>
@@ -1613,10 +3040,11 @@
         </w:rPr>
         <w:t>Semnatura</w:t>
       </w:r>
+      <w:proofErr w:type="spellEnd"/>
     </w:p>
     <w:p>
       <w:pPr>
-        <w:framePr w:w="4470" w:h="1170" w:hRule="exact" w:wrap="auto" w:vAnchor="page" w:hAnchor="page" w:x="733" w:y="13153"/>
+        <w:framePr w:w="4470" w:h="1170" w:hRule="exact" w:wrap="auto" w:vAnchor="page" w:hAnchor="page" w:x="884" w:y="12339"/>
         <w:widowControl w:val="0"/>
         <w:tabs>
           <w:tab w:val="left" w:pos="360"/>
@@ -1655,7 +3083,7 @@
     </w:p>
     <w:p>
       <w:pPr>
-        <w:framePr w:w="4470" w:h="1170" w:hRule="exact" w:wrap="auto" w:vAnchor="page" w:hAnchor="page" w:x="6924" w:y="13118"/>
+        <w:framePr w:w="4157" w:h="1921" w:hRule="exact" w:wrap="auto" w:vAnchor="page" w:hAnchor="page" w:x="7158" w:y="12295"/>
         <w:widowControl w:val="0"/>
         <w:tabs>
           <w:tab w:val="left" w:pos="360"/>
@@ -1682,6 +3110,7 @@
           <w:szCs w:val="24"/>
         </w:rPr>
       </w:pPr>
+      <w:proofErr w:type="spellStart"/>
       <w:r>
         <w:rPr>
           <w:rFonts w:ascii="Arial" w:hAnsi="Arial" w:cs="Arial"/>
@@ -1689,12 +3118,22 @@
           <w:sz w:val="23"/>
           <w:szCs w:val="24"/>
         </w:rPr>
-        <w:t>Unitatea de service</w:t>
+        <w:t>Unitatea</w:t>
+      </w:r>
+      <w:proofErr w:type="spellEnd"/>
+      <w:r>
+        <w:rPr>
+          <w:rFonts w:ascii="Arial" w:hAnsi="Arial" w:cs="Arial"/>
+          <w:color w:val="000000"/>
+          <w:sz w:val="23"/>
+          <w:szCs w:val="24"/>
+        </w:rPr>
+        <w:t xml:space="preserve"> de service</w:t>
       </w:r>
     </w:p>
     <w:p>
       <w:pPr>
-        <w:framePr w:w="4470" w:h="1170" w:hRule="exact" w:wrap="auto" w:vAnchor="page" w:hAnchor="page" w:x="6924" w:y="13118"/>
+        <w:framePr w:w="4157" w:h="1921" w:hRule="exact" w:wrap="auto" w:vAnchor="page" w:hAnchor="page" w:x="7158" w:y="12295"/>
         <w:widowControl w:val="0"/>
         <w:tabs>
           <w:tab w:val="left" w:pos="360"/>
@@ -1724,7 +3163,7 @@
     </w:p>
     <w:p>
       <w:pPr>
-        <w:framePr w:w="4470" w:h="1170" w:hRule="exact" w:wrap="auto" w:vAnchor="page" w:hAnchor="page" w:x="6924" w:y="13118"/>
+        <w:framePr w:w="4157" w:h="1921" w:hRule="exact" w:wrap="auto" w:vAnchor="page" w:hAnchor="page" w:x="7158" w:y="12295"/>
         <w:widowControl w:val="0"/>
         <w:tabs>
           <w:tab w:val="left" w:pos="360"/>
@@ -1758,12 +3197,32 @@
           <w:sz w:val="23"/>
           <w:szCs w:val="24"/>
         </w:rPr>
+        <w:t>{</w:t>
+      </w:r>
+      <w:proofErr w:type="spellStart"/>
+      <w:r>
+        <w:rPr>
+          <w:rFonts w:ascii="Arial" w:hAnsi="Arial" w:cs="Arial"/>
+          <w:color w:val="000000"/>
+          <w:sz w:val="23"/>
+          <w:szCs w:val="24"/>
+        </w:rPr>
         <w:t>Semnatura</w:t>
+      </w:r>
+      <w:proofErr w:type="spellEnd"/>
+      <w:r>
+        <w:rPr>
+          <w:rFonts w:ascii="Arial" w:hAnsi="Arial" w:cs="Arial"/>
+          <w:color w:val="000000"/>
+          <w:sz w:val="23"/>
+          <w:szCs w:val="24"/>
+        </w:rPr>
+        <w:t>}</w:t>
       </w:r>
     </w:p>
     <w:p>
       <w:pPr>
-        <w:framePr w:w="4470" w:h="1170" w:hRule="exact" w:wrap="auto" w:vAnchor="page" w:hAnchor="page" w:x="6924" w:y="13118"/>
+        <w:framePr w:w="4157" w:h="1921" w:hRule="exact" w:wrap="auto" w:vAnchor="page" w:hAnchor="page" w:x="7158" w:y="12295"/>
         <w:widowControl w:val="0"/>
         <w:tabs>
           <w:tab w:val="left" w:pos="360"/>

</xml_diff>